<commit_message>
docs(audit): consolidate sources and refresh delivery evidence
</commit_message>
<xml_diff>
--- a/docs/CATALOGUE_FONCTIONNALITES_V1_ACTUALISE.docx
+++ b/docs/CATALOGUE_FONCTIONNALITES_V1_ACTUALISE.docx
@@ -4,7 +4,7 @@
   <w:body>
     <w:p>
       <w:r>
-        <w:t>Révision documentaire du 21 septembre 2026. Source maintenue : REQUIREMENTS_V1.md. Les preuves datées et les réserves conservent leur portée ; ce document ne constitue pas une recette de production.</w:t>
+        <w:t>Révision documentaire du 24 septembre 2026. État de livraison : docs/ETAT_COURANT.md. Source maintenue : REQUIREMENTS_V1.md. Les preuves datées et les réserves conservent leur portée ; ce document ne constitue pas une recette de production.</w:t>
       </w:r>
     </w:p>
     <w:p>
@@ -17,7 +17,12 @@
     </w:p>
     <w:p>
       <w:r>
-        <w:t>Version documentaire : 21 septembre 2026. Ce document définit le périmètre retenu et les conditions de validation. « Présent dans le code » ne signifie pas « recetté sur la version publiée ».</w:t>
+        <w:t>&gt; Actualisation du 24 septembre : voir l’état courant (ETAT_COURANT.md) pour les nouveaux rappels préparés, les tests et la différence avec la production. Les preuves datées ci-dessous conservent leur portée.</w:t>
+      </w:r>
+    </w:p>
+    <w:p>
+      <w:r>
+        <w:t>Version documentaire : 22 septembre 2026. Ce document définit le périmètre retenu et les conditions de validation. « Présent dans le code » ne signifie pas « recetté sur la version publiée ».</w:t>
       </w:r>
     </w:p>
     <w:p>
@@ -112,7 +117,7 @@
           </w:tcPr>
           <w:p>
             <w:r>
-              <w:t>Besoins, missions, examen des candidatures et affectations autorisées</w:t>
+              <w:t>Création et publication directe des missions, examen des candidatures et affectations autorisées</w:t>
             </w:r>
           </w:p>
         </w:tc>
@@ -142,7 +147,7 @@
     </w:tbl>
     <w:p>
       <w:r>
-        <w:t>InfiMatch assure la mise en relation. Les agences emploient et paient. Hors périmètre validé : paie, signature électronique et contrat complet. Le PDF de confirmation n'est pas présenté comme un contrat signé.</w:t>
+        <w:t>InfiMatch assure la mise en relation. Les agences emploient et paient. Hors périmètre validé : paie, signature électronique et contrat complet. Le PDF de confirmation n'est pas présenté comme un contrat signé. La répartition métier validée pour la démonstration (quality/PERIMETRE_METIER_A06_2026-09-22.md) distingue les responsabilités des acteurs, les contrôles logiciels et les étapes humaines.</w:t>
       </w:r>
     </w:p>
     <w:p>
@@ -928,7 +933,7 @@
           </w:tcPr>
           <w:p>
             <w:r>
-              <w:t>État RPPS réel, attente et échec explicites ; pas de validation fictive ou de certification d'identité déduite</w:t>
+              <w:t>État RPPS conservé, attente et échec explicites, aucune validation fictive ; distinguer éligibilité du matching et candidature volontaire</w:t>
             </w:r>
           </w:p>
         </w:tc>
@@ -950,7 +955,7 @@
           </w:tcPr>
           <w:p>
             <w:r>
-              <w:t>Décision humaine</w:t>
+              <w:t>Décision humaine malgré un profil incomplet</w:t>
             </w:r>
           </w:p>
         </w:tc>
@@ -960,7 +965,7 @@
           </w:tcPr>
           <w:p>
             <w:r>
-              <w:t>Matching et avertissements aident la décision ; les permissions et critères bloquants sont appliqués côté serveur</w:t>
+              <w:t>Candidature et acceptation/refus possibles malgré les alertes sur les informations manquantes ou les écarts avec la mission ; permissions, dates et conflits d’affectation restent contrôlés côté serveur</w:t>
             </w:r>
           </w:p>
         </w:tc>
@@ -1152,6 +1157,29 @@
     <w:p>
       <w:r>
         <w:t>Architecture technique (SCHEMA_ARCHITECTURE_V1.md), flux métier (FLUX_V1.md), automatisations et preuves (AUTOMATISATIONS.md), guide utilisateur (GUIDE_UTILISATEUR.md) et inventaire documentaire (INVENTAIRE_DOCUMENTAIRE.md). Les six tutoriels vidéo ont été réenregistrés et contrôlés le 21 septembre 2026 : périmètre et preuves (quality/TUTORIELS_VIDEO_2026-09-21.md). La répétition humaine du support oral reste à faire.</w:t>
+      </w:r>
+    </w:p>
+    <w:p>
+      <w:pPr>
+        <w:pStyle w:val="Heading3"/>
+      </w:pPr>
+      <w:r>
+        <w:t>Profil incomplet, RPPS et décision humaine</w:t>
+      </w:r>
+    </w:p>
+    <w:p>
+      <w:r>
+        <w:t>Bloquer systématiquement une candidature ou son examen parce que le profil est incomplet serait trop restrictif. Le candidat peut candidater et l’entreprise ou l’agence peut accepter ou refuser malgré les avertissements correspondant aux informations manquantes et aux écarts avec la mission. Le statut RPPS est conservé sans validation fictive. Les permissions, les dates et les conflits d’affectation restent contrôlés.</w:t>
+      </w:r>
+    </w:p>
+    <w:p>
+      <w:r>
+        <w:t>Le réglage DEMO_OPTIONAL_RPPS=true concerne le critère RPPS du matching interne. Sans ce réglage, ce critère redevient strict dans le matching ; cela ne rend pas les alertes RPPS automatiquement bloquantes pour une candidature volontaire ou son acceptation. Les horaires doivent être confirmés avant l’affectation. Les offres externes conservent leur comparaison partielle et leurs propres conditions.</w:t>
+      </w:r>
+    </w:p>
+    <w:p>
+      <w:r>
+        <w:t>La politique de candidature et d’affectation (quality/POLITIQUE_CANDIDATURE_AFFECTATION_2026-09-22.md) détaille cette distinction, les avertissements et les tests associés.</w:t>
       </w:r>
     </w:p>
     <w:sectPr>

</xml_diff>